<commit_message>
Minor update, spaces removed.
</commit_message>
<xml_diff>
--- a/documents/ExtendedEthiopicSamples-Ethiop.docx
+++ b/documents/ExtendedEthiopicSamples-Ethiop.docx
@@ -14259,7 +14259,7 @@
           <w:noProof/>
         </w:rPr>
         <w:pict>
-          <v:rect id="_x0000_i1028" alt="" style="width:338.35pt;height:.05pt;mso-width-percent:0;mso-height-percent:0;mso-width-percent:0;mso-height-percent:0" o:hrpct="723" o:hralign="center" o:hrstd="t" o:hr="t" fillcolor="#9d9da1" stroked="f"/>
+          <v:rect id="_x0000_i1028" alt="" style="width:326.2pt;height:.05pt;mso-width-percent:0;mso-height-percent:0;mso-width-percent:0;mso-height-percent:0" o:hrpct="697" o:hralign="center" o:hrstd="t" o:hr="t" fillcolor="#9d9da1" stroked="f"/>
         </w:pict>
       </w:r>
     </w:p>
@@ -15746,7 +15746,7 @@
           <w:noProof/>
         </w:rPr>
         <w:pict>
-          <v:rect id="_x0000_i1027" alt="" style="width:338.35pt;height:.05pt;mso-width-percent:0;mso-height-percent:0;mso-width-percent:0;mso-height-percent:0" o:hrpct="723" o:hralign="center" o:hrstd="t" o:hr="t" fillcolor="#9d9da1" stroked="f"/>
+          <v:rect id="_x0000_i1027" alt="" style="width:326.2pt;height:.05pt;mso-width-percent:0;mso-height-percent:0;mso-width-percent:0;mso-height-percent:0" o:hrpct="697" o:hralign="center" o:hrstd="t" o:hr="t" fillcolor="#9d9da1" stroked="f"/>
         </w:pict>
       </w:r>
     </w:p>
@@ -16740,7 +16740,7 @@
           <w:noProof/>
         </w:rPr>
         <w:pict>
-          <v:rect id="_x0000_i1026" alt="" style="width:338.35pt;height:.05pt;mso-width-percent:0;mso-height-percent:0;mso-width-percent:0;mso-height-percent:0" o:hrpct="723" o:hralign="center" o:hrstd="t" o:hr="t" fillcolor="#9d9da1" stroked="f"/>
+          <v:rect id="_x0000_i1026" alt="" style="width:326.2pt;height:.05pt;mso-width-percent:0;mso-height-percent:0;mso-width-percent:0;mso-height-percent:0" o:hrpct="697" o:hralign="center" o:hrstd="t" o:hr="t" fillcolor="#9d9da1" stroked="f"/>
         </w:pict>
       </w:r>
     </w:p>
@@ -17804,7 +17804,7 @@
           <w:noProof/>
         </w:rPr>
         <w:pict>
-          <v:rect id="_x0000_i1025" alt="" style="width:338.35pt;height:.05pt;mso-width-percent:0;mso-height-percent:0;mso-width-percent:0;mso-height-percent:0" o:hrpct="723" o:hralign="center" o:hrstd="t" o:hr="t" fillcolor="#9d9da1" stroked="f"/>
+          <v:rect id="_x0000_i1025" alt="" style="width:326.2pt;height:.05pt;mso-width-percent:0;mso-height-percent:0;mso-width-percent:0;mso-height-percent:0" o:hrpct="697" o:hralign="center" o:hrstd="t" o:hr="t" fillcolor="#9d9da1" stroked="f"/>
         </w:pict>
       </w:r>
     </w:p>
@@ -26059,7 +26059,7 @@
           <w:sz w:val="16"/>
           <w:szCs w:val="16"/>
         </w:rPr>
-        <w:t>መሠረሰሸⶠቀⷀቐበ ቨተቸⶨኀነኘአከⷈኸⷐወዐዘዠⶰየደዸጀገⷘጘጠጨⶸጰጸፀፈፐ</w:t>
+        <w:t>መሠረሰሸⶠቀⷀቐበቨተቸⶨኀነኘአከⷈኸⷐወዐዘዠⶰየደዸጀገⷘጘጠጨⶸጰጸፀፈፐ</w:t>
       </w:r>
       <w:r>
         <w:rPr>
@@ -26091,7 +26091,7 @@
           <w:sz w:val="18"/>
           <w:szCs w:val="18"/>
         </w:rPr>
-        <w:t>መሠረሰሸⶠቀⷀቐበ ቨተቸⶨኀነኘአከⷈኸⷐወዐዘዠⶰየደዸጀገⷘጘጠጨⶸጰጸፀፈፐ</w:t>
+        <w:t>መሠረሰሸⶠቀⷀቐበቨተቸⶨኀነኘአከⷈኸⷐወዐዘዠⶰየደዸጀገⷘጘጠጨⶸጰጸፀፈፐ</w:t>
       </w:r>
       <w:r>
         <w:rPr>
@@ -26123,7 +26123,7 @@
           <w:sz w:val="20"/>
           <w:szCs w:val="20"/>
         </w:rPr>
-        <w:t>መሠረሰሸⶠቀⷀቐበ ቨተቸⶨኀነኘአከⷈኸⷐወዐዘዠⶰየደዸጀገⷘጘጠጨⶸጰጸፀፈፐ</w:t>
+        <w:t>መሠረሰሸⶠቀⷀቐበቨተቸⶨኀነኘአከⷈኸⷐወዐዘዠⶰየደዸጀገⷘጘጠጨⶸጰጸፀፈፐ</w:t>
       </w:r>
       <w:r>
         <w:rPr>
@@ -26149,7 +26149,7 @@
         <w:rPr>
           <w:rFonts w:ascii="ethiop_NEW" w:eastAsia="MS Mincho" w:hAnsi="ethiop_NEW" w:cs="Abyssinica SIL"/>
         </w:rPr>
-        <w:t>መሠረሰሸⶠቀⷀቐበ ቨተቸⶨኀነኘአከⷈኸⷐወዐዘዠⶰየደዸጀገⷘጘጠጨⶸጰጸፀፈፐ</w:t>
+        <w:t>መሠረሰሸⶠቀⷀቐበቨተቸⶨኀነኘአከⷈኸⷐወዐዘዠⶰየደዸጀገⷘጘጠጨⶸጰጸፀፈፐ</w:t>
       </w:r>
       <w:r>
         <w:rPr>
@@ -26179,7 +26179,7 @@
           <w:sz w:val="24"/>
           <w:szCs w:val="24"/>
         </w:rPr>
-        <w:t>መሠረሰሸⶠቀⷀቐበ ቨተቸⶨኀነኘአከⷈኸⷐወዐዘዠⶰየደዸጀገⷘጘጠጨⶸጰጸፀፈፐ</w:t>
+        <w:t>መሠረሰሸⶠቀⷀቐበቨተቸⶨኀነኘአከⷈኸⷐወዐዘዠⶰየደዸጀገⷘጘጠጨⶸጰጸፀፈፐ</w:t>
       </w:r>
     </w:p>
     <w:p>

</xml_diff>